<commit_message>
vault backup: 2023-01-04 10:35:17
</commit_message>
<xml_diff>
--- a/Digimatic_analyse/DIgimatic Analyse für Handmess geräte.docx
+++ b/Digimatic_analyse/DIgimatic Analyse für Handmess geräte.docx
@@ -88,6 +88,9 @@
         <w:pStyle w:val="Listenabsatz"/>
       </w:pPr>
       <w:r>
+        <w:rPr>
+          <w:noProof/>
+        </w:rPr>
         <w:drawing>
           <wp:inline distT="0" distB="0" distL="0" distR="0" wp14:anchorId="135359DB" wp14:editId="1A48EC3F">
             <wp:extent cx="4174658" cy="2562225"/>
@@ -130,6 +133,9 @@
         <w:ind w:firstLine="360"/>
       </w:pPr>
       <w:r>
+        <w:rPr>
+          <w:noProof/>
+        </w:rPr>
         <w:drawing>
           <wp:inline distT="0" distB="0" distL="0" distR="0" wp14:anchorId="1955581E" wp14:editId="7644B2BD">
             <wp:extent cx="3875616" cy="1587500"/>
@@ -875,6 +881,193 @@
       </w:tr>
       <w:tr>
         <w:trPr>
+          <w:trHeight w:val="300"/>
+        </w:trPr>
+        <w:tc>
+          <w:tcPr>
+            <w:tcW w:w="2542" w:type="dxa"/>
+            <w:tcBorders>
+              <w:top w:val="nil"/>
+              <w:left w:val="single" w:sz="8" w:space="0" w:color="auto"/>
+              <w:bottom w:val="single" w:sz="4" w:space="0" w:color="auto"/>
+              <w:right w:val="single" w:sz="4" w:space="0" w:color="auto"/>
+            </w:tcBorders>
+            <w:shd w:val="clear" w:color="auto" w:fill="auto"/>
+            <w:vAlign w:val="center"/>
+          </w:tcPr>
+          <w:p>
+            <w:pPr>
+              <w:spacing w:after="0" w:line="240" w:lineRule="auto"/>
+              <w:jc w:val="center"/>
+              <w:rPr>
+                <w:rFonts w:ascii="Calibri" w:eastAsia="Times New Roman" w:hAnsi="Calibri" w:cs="Calibri"/>
+                <w:color w:val="000000"/>
+                <w:lang w:eastAsia="de-DE"/>
+              </w:rPr>
+            </w:pPr>
+            <w:r>
+              <w:rPr>
+                <w:rFonts w:ascii="Calibri" w:eastAsia="Times New Roman" w:hAnsi="Calibri" w:cs="Calibri"/>
+                <w:color w:val="000000"/>
+                <w:lang w:eastAsia="de-DE"/>
+              </w:rPr>
+              <w:t>25EWR</w:t>
+            </w:r>
+          </w:p>
+        </w:tc>
+        <w:tc>
+          <w:tcPr>
+            <w:tcW w:w="1038" w:type="dxa"/>
+            <w:tcBorders>
+              <w:top w:val="nil"/>
+              <w:left w:val="nil"/>
+              <w:bottom w:val="single" w:sz="4" w:space="0" w:color="auto"/>
+              <w:right w:val="single" w:sz="4" w:space="0" w:color="auto"/>
+            </w:tcBorders>
+            <w:shd w:val="clear" w:color="auto" w:fill="auto"/>
+            <w:noWrap/>
+            <w:vAlign w:val="center"/>
+          </w:tcPr>
+          <w:p>
+            <w:pPr>
+              <w:spacing w:after="0" w:line="240" w:lineRule="auto"/>
+              <w:jc w:val="center"/>
+              <w:rPr>
+                <w:rFonts w:ascii="Calibri" w:eastAsia="Times New Roman" w:hAnsi="Calibri" w:cs="Calibri"/>
+                <w:color w:val="000000"/>
+                <w:lang w:eastAsia="de-DE"/>
+              </w:rPr>
+            </w:pPr>
+          </w:p>
+        </w:tc>
+        <w:tc>
+          <w:tcPr>
+            <w:tcW w:w="1200" w:type="dxa"/>
+            <w:tcBorders>
+              <w:top w:val="nil"/>
+              <w:left w:val="nil"/>
+              <w:bottom w:val="single" w:sz="4" w:space="0" w:color="auto"/>
+              <w:right w:val="single" w:sz="4" w:space="0" w:color="auto"/>
+            </w:tcBorders>
+            <w:shd w:val="clear" w:color="auto" w:fill="auto"/>
+            <w:noWrap/>
+            <w:vAlign w:val="center"/>
+          </w:tcPr>
+          <w:p>
+            <w:pPr>
+              <w:spacing w:after="0" w:line="240" w:lineRule="auto"/>
+              <w:jc w:val="center"/>
+              <w:rPr>
+                <w:rFonts w:ascii="Calibri" w:eastAsia="Times New Roman" w:hAnsi="Calibri" w:cs="Calibri"/>
+                <w:color w:val="000000"/>
+                <w:lang w:eastAsia="de-DE"/>
+              </w:rPr>
+            </w:pPr>
+          </w:p>
+        </w:tc>
+        <w:tc>
+          <w:tcPr>
+            <w:tcW w:w="1200" w:type="dxa"/>
+            <w:tcBorders>
+              <w:top w:val="nil"/>
+              <w:left w:val="nil"/>
+              <w:bottom w:val="single" w:sz="4" w:space="0" w:color="auto"/>
+              <w:right w:val="single" w:sz="4" w:space="0" w:color="auto"/>
+            </w:tcBorders>
+            <w:shd w:val="clear" w:color="auto" w:fill="auto"/>
+            <w:noWrap/>
+            <w:vAlign w:val="center"/>
+          </w:tcPr>
+          <w:p>
+            <w:pPr>
+              <w:spacing w:after="0" w:line="240" w:lineRule="auto"/>
+              <w:jc w:val="center"/>
+              <w:rPr>
+                <w:rFonts w:ascii="Calibri" w:eastAsia="Times New Roman" w:hAnsi="Calibri" w:cs="Calibri"/>
+                <w:color w:val="000000"/>
+                <w:lang w:eastAsia="de-DE"/>
+              </w:rPr>
+            </w:pPr>
+          </w:p>
+        </w:tc>
+        <w:tc>
+          <w:tcPr>
+            <w:tcW w:w="1200" w:type="dxa"/>
+            <w:tcBorders>
+              <w:top w:val="nil"/>
+              <w:left w:val="nil"/>
+              <w:bottom w:val="single" w:sz="4" w:space="0" w:color="auto"/>
+              <w:right w:val="single" w:sz="4" w:space="0" w:color="auto"/>
+            </w:tcBorders>
+            <w:shd w:val="clear" w:color="auto" w:fill="auto"/>
+            <w:noWrap/>
+            <w:vAlign w:val="center"/>
+          </w:tcPr>
+          <w:p>
+            <w:pPr>
+              <w:spacing w:after="0" w:line="240" w:lineRule="auto"/>
+              <w:jc w:val="center"/>
+              <w:rPr>
+                <w:rFonts w:ascii="Calibri" w:eastAsia="Times New Roman" w:hAnsi="Calibri" w:cs="Calibri"/>
+                <w:color w:val="000000"/>
+                <w:lang w:eastAsia="de-DE"/>
+              </w:rPr>
+            </w:pPr>
+          </w:p>
+        </w:tc>
+        <w:tc>
+          <w:tcPr>
+            <w:tcW w:w="1391" w:type="dxa"/>
+            <w:tcBorders>
+              <w:top w:val="nil"/>
+              <w:left w:val="nil"/>
+              <w:bottom w:val="single" w:sz="4" w:space="0" w:color="auto"/>
+              <w:right w:val="single" w:sz="4" w:space="0" w:color="auto"/>
+            </w:tcBorders>
+            <w:shd w:val="clear" w:color="auto" w:fill="auto"/>
+            <w:noWrap/>
+            <w:vAlign w:val="center"/>
+          </w:tcPr>
+          <w:p>
+            <w:pPr>
+              <w:spacing w:after="0" w:line="240" w:lineRule="auto"/>
+              <w:jc w:val="center"/>
+              <w:rPr>
+                <w:rFonts w:ascii="Calibri" w:eastAsia="Times New Roman" w:hAnsi="Calibri" w:cs="Calibri"/>
+                <w:color w:val="000000"/>
+                <w:lang w:eastAsia="de-DE"/>
+              </w:rPr>
+            </w:pPr>
+          </w:p>
+        </w:tc>
+        <w:tc>
+          <w:tcPr>
+            <w:tcW w:w="1009" w:type="dxa"/>
+            <w:tcBorders>
+              <w:top w:val="nil"/>
+              <w:left w:val="nil"/>
+              <w:bottom w:val="single" w:sz="4" w:space="0" w:color="auto"/>
+              <w:right w:val="single" w:sz="8" w:space="0" w:color="auto"/>
+            </w:tcBorders>
+            <w:shd w:val="clear" w:color="auto" w:fill="auto"/>
+            <w:noWrap/>
+            <w:vAlign w:val="center"/>
+          </w:tcPr>
+          <w:p>
+            <w:pPr>
+              <w:spacing w:after="0" w:line="240" w:lineRule="auto"/>
+              <w:jc w:val="center"/>
+              <w:rPr>
+                <w:rFonts w:ascii="Calibri" w:eastAsia="Times New Roman" w:hAnsi="Calibri" w:cs="Calibri"/>
+                <w:color w:val="000000"/>
+                <w:lang w:eastAsia="de-DE"/>
+              </w:rPr>
+            </w:pPr>
+          </w:p>
+        </w:tc>
+      </w:tr>
+      <w:tr>
+        <w:trPr>
           <w:trHeight w:val="315"/>
         </w:trPr>
         <w:tc>
@@ -943,7 +1136,6 @@
               </w:rPr>
               <w:t>/</w:t>
             </w:r>
-            <w:proofErr w:type="gramStart"/>
             <w:r>
               <w:rPr>
                 <w:rFonts w:ascii="Calibri" w:eastAsia="Times New Roman" w:hAnsi="Calibri" w:cs="Calibri"/>
@@ -966,16 +1158,7 @@
                 <w:color w:val="000000"/>
                 <w:lang w:eastAsia="de-DE"/>
               </w:rPr>
-              <w:t>(</w:t>
-            </w:r>
-            <w:proofErr w:type="gramEnd"/>
-            <w:r>
-              <w:rPr>
-                <w:rFonts w:ascii="Calibri" w:eastAsia="Times New Roman" w:hAnsi="Calibri" w:cs="Calibri"/>
-                <w:color w:val="000000"/>
-                <w:lang w:eastAsia="de-DE"/>
-              </w:rPr>
-              <w:t>B)</w:t>
+              <w:t>(B)</w:t>
             </w:r>
             <w:r>
               <w:rPr>
@@ -1239,13 +1422,7 @@
         </w:rPr>
       </w:pPr>
       <w:r>
-        <w:t xml:space="preserve">Geräte mit </w:t>
-      </w:r>
-      <w:r>
-        <w:t>5</w:t>
-      </w:r>
-      <w:r>
-        <w:t xml:space="preserve">-polligen </w:t>
+        <w:t xml:space="preserve">Geräte mit 5-polligen </w:t>
       </w:r>
       <w:proofErr w:type="spellStart"/>
       <w:r>
@@ -1259,13 +1436,7 @@
         <w:t>K</w:t>
       </w:r>
       <w:r>
-        <w:t>abel</w:t>
-      </w:r>
-      <w:r>
-        <w:t xml:space="preserve"> DK-D1</w:t>
-      </w:r>
-      <w:r>
-        <w:t xml:space="preserve">, Art. </w:t>
+        <w:t xml:space="preserve">abel DK-D1, Art. </w:t>
       </w:r>
       <w:r>
         <w:rPr>
@@ -1274,16 +1445,7 @@
           <w:i/>
           <w:iCs/>
         </w:rPr>
-        <w:t>41</w:t>
-      </w:r>
-      <w:r>
-        <w:rPr>
-          <w:b/>
-          <w:bCs/>
-          <w:i/>
-          <w:iCs/>
-        </w:rPr>
-        <w:t>02</w:t>
+        <w:t>4102</w:t>
       </w:r>
       <w:r>
         <w:rPr>

</xml_diff>

<commit_message>
vault backup: 2023-01-04 11:21:17
</commit_message>
<xml_diff>
--- a/Digimatic_analyse/DIgimatic Analyse für Handmess geräte.docx
+++ b/Digimatic_analyse/DIgimatic Analyse für Handmess geräte.docx
@@ -217,16 +217,13 @@
           <w:i/>
           <w:iCs/>
         </w:rPr>
-        <w:t>4102411</w:t>
+        <w:t>4102915</w:t>
       </w:r>
       <w:r>
-        <w:t>.</w:t>
+        <w:t xml:space="preserve"> (</w:t>
       </w:r>
       <w:r>
-        <w:t xml:space="preserve"> (4102915</w:t>
-      </w:r>
-      <w:r>
-        <w:t>??</w:t>
+        <w:t>4102411</w:t>
       </w:r>
       <w:r>
         <w:t>)</w:t>
@@ -235,6 +232,7 @@
     <w:tbl>
       <w:tblPr>
         <w:tblW w:w="9580" w:type="dxa"/>
+        <w:tblLayout w:type="fixed"/>
         <w:tblCellMar>
           <w:left w:w="70" w:type="dxa"/>
           <w:right w:w="70" w:type="dxa"/>
@@ -242,13 +240,13 @@
         <w:tblLook w:val="04A0" w:firstRow="1" w:lastRow="0" w:firstColumn="1" w:lastColumn="0" w:noHBand="0" w:noVBand="1"/>
       </w:tblPr>
       <w:tblGrid>
-        <w:gridCol w:w="2542"/>
-        <w:gridCol w:w="1038"/>
-        <w:gridCol w:w="1200"/>
-        <w:gridCol w:w="1200"/>
-        <w:gridCol w:w="1200"/>
-        <w:gridCol w:w="1391"/>
-        <w:gridCol w:w="1009"/>
+        <w:gridCol w:w="2825"/>
+        <w:gridCol w:w="1125"/>
+        <w:gridCol w:w="1126"/>
+        <w:gridCol w:w="1126"/>
+        <w:gridCol w:w="1126"/>
+        <w:gridCol w:w="1126"/>
+        <w:gridCol w:w="1126"/>
       </w:tblGrid>
       <w:tr>
         <w:trPr>
@@ -256,7 +254,7 @@
         </w:trPr>
         <w:tc>
           <w:tcPr>
-            <w:tcW w:w="2542" w:type="dxa"/>
+            <w:tcW w:w="2825" w:type="dxa"/>
             <w:tcBorders>
               <w:top w:val="single" w:sz="8" w:space="0" w:color="auto"/>
               <w:left w:val="single" w:sz="8" w:space="0" w:color="auto"/>
@@ -298,7 +296,7 @@
         </w:tc>
         <w:tc>
           <w:tcPr>
-            <w:tcW w:w="1038" w:type="dxa"/>
+            <w:tcW w:w="1125" w:type="dxa"/>
             <w:tcBorders>
               <w:top w:val="single" w:sz="8" w:space="0" w:color="auto"/>
               <w:left w:val="nil"/>
@@ -366,7 +364,7 @@
         </w:tc>
         <w:tc>
           <w:tcPr>
-            <w:tcW w:w="1200" w:type="dxa"/>
+            <w:tcW w:w="1126" w:type="dxa"/>
             <w:tcBorders>
               <w:top w:val="single" w:sz="8" w:space="0" w:color="auto"/>
               <w:left w:val="nil"/>
@@ -408,7 +406,7 @@
         </w:tc>
         <w:tc>
           <w:tcPr>
-            <w:tcW w:w="1200" w:type="dxa"/>
+            <w:tcW w:w="1126" w:type="dxa"/>
             <w:tcBorders>
               <w:top w:val="single" w:sz="8" w:space="0" w:color="auto"/>
               <w:left w:val="nil"/>
@@ -450,7 +448,7 @@
         </w:tc>
         <w:tc>
           <w:tcPr>
-            <w:tcW w:w="1200" w:type="dxa"/>
+            <w:tcW w:w="1126" w:type="dxa"/>
             <w:tcBorders>
               <w:top w:val="single" w:sz="8" w:space="0" w:color="auto"/>
               <w:left w:val="nil"/>
@@ -492,7 +490,7 @@
         </w:tc>
         <w:tc>
           <w:tcPr>
-            <w:tcW w:w="1391" w:type="dxa"/>
+            <w:tcW w:w="1126" w:type="dxa"/>
             <w:tcBorders>
               <w:top w:val="single" w:sz="8" w:space="0" w:color="auto"/>
               <w:left w:val="nil"/>
@@ -560,7 +558,7 @@
         </w:tc>
         <w:tc>
           <w:tcPr>
-            <w:tcW w:w="1009" w:type="dxa"/>
+            <w:tcW w:w="1126" w:type="dxa"/>
             <w:tcBorders>
               <w:top w:val="single" w:sz="8" w:space="0" w:color="auto"/>
               <w:left w:val="nil"/>
@@ -633,7 +631,7 @@
         </w:trPr>
         <w:tc>
           <w:tcPr>
-            <w:tcW w:w="2542" w:type="dxa"/>
+            <w:tcW w:w="2825" w:type="dxa"/>
             <w:tcBorders>
               <w:top w:val="nil"/>
               <w:left w:val="single" w:sz="8" w:space="0" w:color="auto"/>
@@ -654,29 +652,27 @@
                 <w:lang w:eastAsia="de-DE"/>
               </w:rPr>
             </w:pPr>
-            <w:proofErr w:type="spellStart"/>
-            <w:r>
-              <w:rPr>
-                <w:rFonts w:ascii="Calibri" w:eastAsia="Times New Roman" w:hAnsi="Calibri" w:cs="Calibri"/>
-                <w:color w:val="000000"/>
-                <w:lang w:eastAsia="de-DE"/>
-              </w:rPr>
-              <w:t>MarCator</w:t>
-            </w:r>
-            <w:proofErr w:type="spellEnd"/>
-            <w:r>
-              <w:rPr>
-                <w:rFonts w:ascii="Calibri" w:eastAsia="Times New Roman" w:hAnsi="Calibri" w:cs="Calibri"/>
-                <w:color w:val="000000"/>
-                <w:lang w:eastAsia="de-DE"/>
-              </w:rPr>
-              <w:t xml:space="preserve"> 1075R / 25EWR</w:t>
-            </w:r>
-          </w:p>
-        </w:tc>
-        <w:tc>
-          <w:tcPr>
-            <w:tcW w:w="1038" w:type="dxa"/>
+            <w:r>
+              <w:rPr>
+                <w:rFonts w:ascii="Calibri" w:eastAsia="Times New Roman" w:hAnsi="Calibri" w:cs="Calibri"/>
+                <w:color w:val="000000"/>
+                <w:lang w:eastAsia="de-DE"/>
+              </w:rPr>
+              <w:t>18</w:t>
+            </w:r>
+            <w:r>
+              <w:rPr>
+                <w:rFonts w:ascii="Calibri" w:eastAsia="Times New Roman" w:hAnsi="Calibri" w:cs="Calibri"/>
+                <w:color w:val="000000"/>
+                <w:lang w:eastAsia="de-DE"/>
+              </w:rPr>
+              <w:t>/25EWR</w:t>
+            </w:r>
+          </w:p>
+        </w:tc>
+        <w:tc>
+          <w:tcPr>
+            <w:tcW w:w="1125" w:type="dxa"/>
             <w:tcBorders>
               <w:top w:val="nil"/>
               <w:left w:val="nil"/>
@@ -710,7 +706,7 @@
         </w:tc>
         <w:tc>
           <w:tcPr>
-            <w:tcW w:w="1200" w:type="dxa"/>
+            <w:tcW w:w="1126" w:type="dxa"/>
             <w:tcBorders>
               <w:top w:val="nil"/>
               <w:left w:val="nil"/>
@@ -744,7 +740,7 @@
         </w:tc>
         <w:tc>
           <w:tcPr>
-            <w:tcW w:w="1200" w:type="dxa"/>
+            <w:tcW w:w="1126" w:type="dxa"/>
             <w:tcBorders>
               <w:top w:val="nil"/>
               <w:left w:val="nil"/>
@@ -778,7 +774,7 @@
         </w:tc>
         <w:tc>
           <w:tcPr>
-            <w:tcW w:w="1200" w:type="dxa"/>
+            <w:tcW w:w="1126" w:type="dxa"/>
             <w:tcBorders>
               <w:top w:val="nil"/>
               <w:left w:val="nil"/>
@@ -812,7 +808,7 @@
         </w:tc>
         <w:tc>
           <w:tcPr>
-            <w:tcW w:w="1391" w:type="dxa"/>
+            <w:tcW w:w="1126" w:type="dxa"/>
             <w:tcBorders>
               <w:top w:val="nil"/>
               <w:left w:val="nil"/>
@@ -846,7 +842,7 @@
         </w:tc>
         <w:tc>
           <w:tcPr>
-            <w:tcW w:w="1009" w:type="dxa"/>
+            <w:tcW w:w="1126" w:type="dxa"/>
             <w:tcBorders>
               <w:top w:val="nil"/>
               <w:left w:val="nil"/>
@@ -885,7 +881,7 @@
         </w:trPr>
         <w:tc>
           <w:tcPr>
-            <w:tcW w:w="2542" w:type="dxa"/>
+            <w:tcW w:w="2825" w:type="dxa"/>
             <w:tcBorders>
               <w:top w:val="nil"/>
               <w:left w:val="single" w:sz="8" w:space="0" w:color="auto"/>
@@ -905,19 +901,37 @@
                 <w:lang w:eastAsia="de-DE"/>
               </w:rPr>
             </w:pPr>
-            <w:r>
-              <w:rPr>
-                <w:rFonts w:ascii="Calibri" w:eastAsia="Times New Roman" w:hAnsi="Calibri" w:cs="Calibri"/>
-                <w:color w:val="000000"/>
-                <w:lang w:eastAsia="de-DE"/>
-              </w:rPr>
-              <w:t>25EWR</w:t>
-            </w:r>
-          </w:p>
-        </w:tc>
-        <w:tc>
-          <w:tcPr>
-            <w:tcW w:w="1038" w:type="dxa"/>
+            <w:proofErr w:type="spellStart"/>
+            <w:r>
+              <w:rPr>
+                <w:rFonts w:ascii="Calibri" w:eastAsia="Times New Roman" w:hAnsi="Calibri" w:cs="Calibri"/>
+                <w:color w:val="000000"/>
+                <w:lang w:eastAsia="de-DE"/>
+              </w:rPr>
+              <w:t>MarCator</w:t>
+            </w:r>
+            <w:proofErr w:type="spellEnd"/>
+            <w:r>
+              <w:rPr>
+                <w:rFonts w:ascii="Calibri" w:eastAsia="Times New Roman" w:hAnsi="Calibri" w:cs="Calibri"/>
+                <w:color w:val="000000"/>
+                <w:lang w:eastAsia="de-DE"/>
+              </w:rPr>
+              <w:t xml:space="preserve"> 1075R</w:t>
+            </w:r>
+            <w:r>
+              <w:rPr>
+                <w:rFonts w:ascii="Calibri" w:eastAsia="Times New Roman" w:hAnsi="Calibri" w:cs="Calibri"/>
+                <w:color w:val="000000"/>
+                <w:lang w:eastAsia="de-DE"/>
+              </w:rPr>
+              <w:t>, 16/30 EWR</w:t>
+            </w:r>
+          </w:p>
+        </w:tc>
+        <w:tc>
+          <w:tcPr>
+            <w:tcW w:w="1125" w:type="dxa"/>
             <w:tcBorders>
               <w:top w:val="nil"/>
               <w:left w:val="nil"/>
@@ -938,11 +952,19 @@
                 <w:lang w:eastAsia="de-DE"/>
               </w:rPr>
             </w:pPr>
-          </w:p>
-        </w:tc>
-        <w:tc>
-          <w:tcPr>
-            <w:tcW w:w="1200" w:type="dxa"/>
+            <w:r>
+              <w:rPr>
+                <w:rFonts w:ascii="SegoeUI" w:hAnsi="SegoeUI" w:cs="SegoeUI"/>
+                <w:sz w:val="21"/>
+                <w:szCs w:val="21"/>
+              </w:rPr>
+              <w:t>166</w:t>
+            </w:r>
+          </w:p>
+        </w:tc>
+        <w:tc>
+          <w:tcPr>
+            <w:tcW w:w="1126" w:type="dxa"/>
             <w:tcBorders>
               <w:top w:val="nil"/>
               <w:left w:val="nil"/>
@@ -963,11 +985,19 @@
                 <w:lang w:eastAsia="de-DE"/>
               </w:rPr>
             </w:pPr>
-          </w:p>
-        </w:tc>
-        <w:tc>
-          <w:tcPr>
-            <w:tcW w:w="1200" w:type="dxa"/>
+            <w:r>
+              <w:rPr>
+                <w:rFonts w:ascii="Calibri" w:eastAsia="Times New Roman" w:hAnsi="Calibri" w:cs="Calibri"/>
+                <w:color w:val="000000"/>
+                <w:lang w:eastAsia="de-DE"/>
+              </w:rPr>
+              <w:t>112</w:t>
+            </w:r>
+          </w:p>
+        </w:tc>
+        <w:tc>
+          <w:tcPr>
+            <w:tcW w:w="1126" w:type="dxa"/>
             <w:tcBorders>
               <w:top w:val="nil"/>
               <w:left w:val="nil"/>
@@ -988,11 +1018,19 @@
                 <w:lang w:eastAsia="de-DE"/>
               </w:rPr>
             </w:pPr>
-          </w:p>
-        </w:tc>
-        <w:tc>
-          <w:tcPr>
-            <w:tcW w:w="1200" w:type="dxa"/>
+            <w:r>
+              <w:rPr>
+                <w:rFonts w:ascii="Calibri" w:eastAsia="Times New Roman" w:hAnsi="Calibri" w:cs="Calibri"/>
+                <w:color w:val="000000"/>
+                <w:lang w:eastAsia="de-DE"/>
+              </w:rPr>
+              <w:t>104</w:t>
+            </w:r>
+          </w:p>
+        </w:tc>
+        <w:tc>
+          <w:tcPr>
+            <w:tcW w:w="1126" w:type="dxa"/>
             <w:tcBorders>
               <w:top w:val="nil"/>
               <w:left w:val="nil"/>
@@ -1013,11 +1051,19 @@
                 <w:lang w:eastAsia="de-DE"/>
               </w:rPr>
             </w:pPr>
-          </w:p>
-        </w:tc>
-        <w:tc>
-          <w:tcPr>
-            <w:tcW w:w="1391" w:type="dxa"/>
+            <w:r>
+              <w:rPr>
+                <w:rFonts w:ascii="Calibri" w:eastAsia="Times New Roman" w:hAnsi="Calibri" w:cs="Calibri"/>
+                <w:color w:val="000000"/>
+                <w:lang w:eastAsia="de-DE"/>
+              </w:rPr>
+              <w:t>136</w:t>
+            </w:r>
+          </w:p>
+        </w:tc>
+        <w:tc>
+          <w:tcPr>
+            <w:tcW w:w="1126" w:type="dxa"/>
             <w:tcBorders>
               <w:top w:val="nil"/>
               <w:left w:val="nil"/>
@@ -1038,11 +1084,19 @@
                 <w:lang w:eastAsia="de-DE"/>
               </w:rPr>
             </w:pPr>
-          </w:p>
-        </w:tc>
-        <w:tc>
-          <w:tcPr>
-            <w:tcW w:w="1009" w:type="dxa"/>
+            <w:r>
+              <w:rPr>
+                <w:rFonts w:ascii="Calibri" w:eastAsia="Times New Roman" w:hAnsi="Calibri" w:cs="Calibri"/>
+                <w:color w:val="000000"/>
+                <w:lang w:eastAsia="de-DE"/>
+              </w:rPr>
+              <w:t>150</w:t>
+            </w:r>
+          </w:p>
+        </w:tc>
+        <w:tc>
+          <w:tcPr>
+            <w:tcW w:w="1126" w:type="dxa"/>
             <w:tcBorders>
               <w:top w:val="nil"/>
               <w:left w:val="nil"/>
@@ -1063,6 +1117,14 @@
                 <w:lang w:eastAsia="de-DE"/>
               </w:rPr>
             </w:pPr>
+            <w:r>
+              <w:rPr>
+                <w:rFonts w:ascii="Calibri" w:eastAsia="Times New Roman" w:hAnsi="Calibri" w:cs="Calibri"/>
+                <w:color w:val="000000"/>
+                <w:lang w:eastAsia="de-DE"/>
+              </w:rPr>
+              <w:t>183</w:t>
+            </w:r>
           </w:p>
         </w:tc>
       </w:tr>
@@ -1072,7 +1134,7 @@
         </w:trPr>
         <w:tc>
           <w:tcPr>
-            <w:tcW w:w="2542" w:type="dxa"/>
+            <w:tcW w:w="2825" w:type="dxa"/>
             <w:tcBorders>
               <w:top w:val="nil"/>
               <w:left w:val="single" w:sz="8" w:space="0" w:color="auto"/>
@@ -1158,7 +1220,15 @@
                 <w:color w:val="000000"/>
                 <w:lang w:eastAsia="de-DE"/>
               </w:rPr>
-              <w:t>(B)</w:t>
+              <w:t xml:space="preserve"> (</w:t>
+            </w:r>
+            <w:r>
+              <w:rPr>
+                <w:rFonts w:ascii="Calibri" w:eastAsia="Times New Roman" w:hAnsi="Calibri" w:cs="Calibri"/>
+                <w:color w:val="000000"/>
+                <w:lang w:eastAsia="de-DE"/>
+              </w:rPr>
+              <w:t>B)</w:t>
             </w:r>
             <w:r>
               <w:rPr>
@@ -1172,7 +1242,7 @@
         </w:tc>
         <w:tc>
           <w:tcPr>
-            <w:tcW w:w="1038" w:type="dxa"/>
+            <w:tcW w:w="1125" w:type="dxa"/>
             <w:tcBorders>
               <w:top w:val="nil"/>
               <w:left w:val="nil"/>
@@ -1206,7 +1276,7 @@
         </w:tc>
         <w:tc>
           <w:tcPr>
-            <w:tcW w:w="1200" w:type="dxa"/>
+            <w:tcW w:w="1126" w:type="dxa"/>
             <w:tcBorders>
               <w:top w:val="nil"/>
               <w:left w:val="nil"/>
@@ -1240,7 +1310,7 @@
         </w:tc>
         <w:tc>
           <w:tcPr>
-            <w:tcW w:w="1200" w:type="dxa"/>
+            <w:tcW w:w="1126" w:type="dxa"/>
             <w:tcBorders>
               <w:top w:val="nil"/>
               <w:left w:val="nil"/>
@@ -1274,7 +1344,7 @@
         </w:tc>
         <w:tc>
           <w:tcPr>
-            <w:tcW w:w="1200" w:type="dxa"/>
+            <w:tcW w:w="1126" w:type="dxa"/>
             <w:tcBorders>
               <w:top w:val="nil"/>
               <w:left w:val="nil"/>
@@ -1308,7 +1378,7 @@
         </w:tc>
         <w:tc>
           <w:tcPr>
-            <w:tcW w:w="1391" w:type="dxa"/>
+            <w:tcW w:w="1126" w:type="dxa"/>
             <w:tcBorders>
               <w:top w:val="nil"/>
               <w:left w:val="nil"/>
@@ -1342,7 +1412,7 @@
         </w:tc>
         <w:tc>
           <w:tcPr>
-            <w:tcW w:w="1009" w:type="dxa"/>
+            <w:tcW w:w="1126" w:type="dxa"/>
             <w:tcBorders>
               <w:top w:val="nil"/>
               <w:left w:val="nil"/>
@@ -1378,21 +1448,6 @@
     </w:tbl>
     <w:p>
       <w:pPr>
-        <w:pStyle w:val="Listenabsatz"/>
-        <w:shd w:val="clear" w:color="auto" w:fill="FFFFFF"/>
-        <w:spacing w:line="285" w:lineRule="atLeast"/>
-        <w:rPr>
-          <w:rFonts w:ascii="Consolas" w:eastAsia="Times New Roman" w:hAnsi="Consolas" w:cs="Times New Roman"/>
-          <w:color w:val="000000"/>
-          <w:sz w:val="21"/>
-          <w:szCs w:val="21"/>
-          <w:lang w:eastAsia="de-DE"/>
-        </w:rPr>
-      </w:pPr>
-    </w:p>
-    <w:p>
-      <w:pPr>
-        <w:pStyle w:val="Listenabsatz"/>
         <w:shd w:val="clear" w:color="auto" w:fill="FFFFFF"/>
         <w:spacing w:line="285" w:lineRule="atLeast"/>
         <w:rPr>

</xml_diff>